<commit_message>
Add reversible native observation from pristine CCL
</commit_message>
<xml_diff>
--- a/doc/WASM/Clozure_CL_WebAssembly_Port_Outline_v0_17.docx
+++ b/doc/WASM/Clozure_CL_WebAssembly_Port_Outline_v0_17.docx
@@ -1856,7 +1856,20 @@
     <w:p>
       <w:r>
         <w:rPr/>
-        <w:t xml:space="preserve">Census track, inside the qualified native compiler: enumerate evaluated acode IDs and flags, front-end elimination and rewrites, native handlers, vinsns, LAP and subprimitives, imports, traps, foreign calls and barrier-sensitive stores; instrument cross-compilation against a census stub backend for static module/function reachability; observe cold-start file opens externally with a macOS file-activity tracer and compare with static load-site projection. Join operator keys (IDs, flags, lowering chains) to module/function keys (dependency reachability, observed load order) through the instrumented compilation record. Registering the stub backend is the first shared edit governed by R6 and is followed by the first R6 comparison.</w:t>
+        <w:t xml:space="preserve">Census track, inside the qualified native compiler: enumerate evaluated acode IDs and flags, front-end elimination and rewrites, native handlers, vinsns, LAP and subprimitives, imports, traps, foreign calls and barrier-sensitive stores; instrument cross-compilation against a census stub backend for static module/function reachability; observe cold-start file opens externally with a macOS file-activity tracer and compare with static load-site projection. Join operator keys (IDs, flags, lowering chains) to module/function keys (dependency reachability, observed load order) through the instrumented compilation record. The 12 September </w:t>
+      </w:r>
+      <w:hyperlink r:id="rId9">
+        <w:r>
+          <w:rPr>
+            <w:color w:val="175C91"/>
+            <w:u w:val="single"/>
+          </w:rPr>
+          <w:t xml:space="preserve">reversible observation step</w:t>
+        </w:r>
+      </w:hyperlink>
+      <w:r>
+        <w:rPr/>
+        <w:t xml:space="preserve"> precedes backend registration and has its own R6 comparison in disposable U1 copies. Subsequent stub registration requires its own authorized shared edit and R6 comparison; implementation starts from pristine U1.</w:t>
       </w:r>
     </w:p>
     <w:p>
@@ -1887,7 +1900,7 @@
       </w:r>
     </w:p>
     <w:p>
-      <w:hyperlink r:id="rId9">
+      <w:hyperlink r:id="rId10">
         <w:r>
           <w:rPr>
             <w:color w:val="175C91"/>
@@ -1900,7 +1913,7 @@
         <w:rPr/>
         <w:t xml:space="preserve"> separates 0A baseline controls, 0B census, 0C representation/engine proofs, 0D integrated control/concurrency, 0E ABI decision/correctness and 0F acceptance. The </w:t>
       </w:r>
-      <w:hyperlink r:id="rId10">
+      <w:hyperlink r:id="rId11">
         <w:r>
           <w:rPr>
             <w:color w:val="175C91"/>
@@ -1915,7 +1928,7 @@
       </w:r>
     </w:p>
     <w:p>
-      <w:hyperlink r:id="rId11">
+      <w:hyperlink r:id="rId12">
         <w:r>
           <w:rPr>
             <w:color w:val="175C91"/>
@@ -1943,7 +1956,7 @@
       </w:r>
     </w:p>
     <w:p>
-      <w:hyperlink r:id="rId12">
+      <w:hyperlink r:id="rId13">
         <w:r>
           <w:rPr>
             <w:color w:val="175C91"/>
@@ -2236,7 +2249,7 @@
         <w:rPr/>
         <w:t xml:space="preserve">[1] </w:t>
       </w:r>
-      <w:hyperlink r:id="rId13">
+      <w:hyperlink r:id="rId14">
         <w:r>
           <w:rPr>
             <w:color w:val="175C91"/>
@@ -2255,7 +2268,7 @@
         <w:rPr/>
         <w:t xml:space="preserve">[2] </w:t>
       </w:r>
-      <w:hyperlink r:id="rId14">
+      <w:hyperlink r:id="rId15">
         <w:r>
           <w:rPr>
             <w:color w:val="175C91"/>
@@ -2274,7 +2287,7 @@
         <w:rPr/>
         <w:t xml:space="preserve">[3] </w:t>
       </w:r>
-      <w:hyperlink r:id="rId15">
+      <w:hyperlink r:id="rId16">
         <w:r>
           <w:rPr>
             <w:color w:val="175C91"/>
@@ -2293,7 +2306,7 @@
         <w:rPr/>
         <w:t xml:space="preserve">[4] </w:t>
       </w:r>
-      <w:hyperlink r:id="rId16">
+      <w:hyperlink r:id="rId17">
         <w:r>
           <w:rPr>
             <w:color w:val="175C91"/>
@@ -2312,7 +2325,7 @@
         <w:rPr/>
         <w:t xml:space="preserve">[5] </w:t>
       </w:r>
-      <w:hyperlink r:id="rId17">
+      <w:hyperlink r:id="rId18">
         <w:r>
           <w:rPr>
             <w:color w:val="175C91"/>
@@ -2331,7 +2344,7 @@
         <w:rPr/>
         <w:t xml:space="preserve">[6] </w:t>
       </w:r>
-      <w:hyperlink r:id="rId18">
+      <w:hyperlink r:id="rId19">
         <w:r>
           <w:rPr>
             <w:color w:val="175C91"/>
@@ -2350,7 +2363,7 @@
         <w:rPr/>
         <w:t xml:space="preserve">[7] </w:t>
       </w:r>
-      <w:hyperlink r:id="rId19">
+      <w:hyperlink r:id="rId20">
         <w:r>
           <w:rPr>
             <w:color w:val="175C91"/>
@@ -2369,7 +2382,7 @@
         <w:rPr/>
         <w:t xml:space="preserve">[8] </w:t>
       </w:r>
-      <w:hyperlink r:id="rId20">
+      <w:hyperlink r:id="rId21">
         <w:r>
           <w:rPr>
             <w:color w:val="175C91"/>
@@ -2388,7 +2401,7 @@
         <w:rPr/>
         <w:t xml:space="preserve">[9] </w:t>
       </w:r>
-      <w:hyperlink r:id="rId21">
+      <w:hyperlink r:id="rId22">
         <w:r>
           <w:rPr>
             <w:color w:val="175C91"/>
@@ -2407,7 +2420,7 @@
         <w:rPr/>
         <w:t xml:space="preserve">[10] </w:t>
       </w:r>
-      <w:hyperlink r:id="rId22">
+      <w:hyperlink r:id="rId23">
         <w:r>
           <w:rPr>
             <w:color w:val="175C91"/>
@@ -2426,7 +2439,7 @@
         <w:rPr/>
         <w:t xml:space="preserve">[11] </w:t>
       </w:r>
-      <w:hyperlink r:id="rId23">
+      <w:hyperlink r:id="rId24">
         <w:r>
           <w:rPr>
             <w:color w:val="175C91"/>
@@ -2445,7 +2458,7 @@
         <w:rPr/>
         <w:t xml:space="preserve">[12] </w:t>
       </w:r>
-      <w:hyperlink r:id="rId24">
+      <w:hyperlink r:id="rId25">
         <w:r>
           <w:rPr>
             <w:color w:val="175C91"/>
@@ -2464,7 +2477,7 @@
         <w:rPr/>
         <w:t xml:space="preserve">[13] </w:t>
       </w:r>
-      <w:hyperlink r:id="rId25">
+      <w:hyperlink r:id="rId26">
         <w:r>
           <w:rPr>
             <w:color w:val="175C91"/>
@@ -2483,7 +2496,7 @@
         <w:rPr/>
         <w:t xml:space="preserve">[14] </w:t>
       </w:r>
-      <w:hyperlink r:id="rId26">
+      <w:hyperlink r:id="rId27">
         <w:r>
           <w:rPr>
             <w:color w:val="175C91"/>
@@ -2502,7 +2515,7 @@
         <w:rPr/>
         <w:t xml:space="preserve">[15] </w:t>
       </w:r>
-      <w:hyperlink r:id="rId27">
+      <w:hyperlink r:id="rId28">
         <w:r>
           <w:rPr>
             <w:color w:val="175C91"/>
@@ -2521,7 +2534,7 @@
         <w:rPr/>
         <w:t xml:space="preserve">[16] </w:t>
       </w:r>
-      <w:hyperlink r:id="rId28">
+      <w:hyperlink r:id="rId29">
         <w:r>
           <w:rPr>
             <w:color w:val="175C91"/>
@@ -2540,7 +2553,7 @@
         <w:rPr/>
         <w:t xml:space="preserve">[17] </w:t>
       </w:r>
-      <w:hyperlink r:id="rId29">
+      <w:hyperlink r:id="rId30">
         <w:r>
           <w:rPr>
             <w:color w:val="175C91"/>
@@ -2559,7 +2572,7 @@
         <w:rPr/>
         <w:t xml:space="preserve">[18] </w:t>
       </w:r>
-      <w:hyperlink r:id="rId30">
+      <w:hyperlink r:id="rId31">
         <w:r>
           <w:rPr>
             <w:color w:val="175C91"/>
@@ -2578,7 +2591,7 @@
         <w:rPr/>
         <w:t xml:space="preserve">[19] </w:t>
       </w:r>
-      <w:hyperlink r:id="rId31">
+      <w:hyperlink r:id="rId32">
         <w:r>
           <w:rPr>
             <w:color w:val="175C91"/>
@@ -2597,7 +2610,7 @@
         <w:rPr/>
         <w:t xml:space="preserve">[20] </w:t>
       </w:r>
-      <w:hyperlink r:id="rId32">
+      <w:hyperlink r:id="rId33">
         <w:r>
           <w:rPr>
             <w:color w:val="175C91"/>
@@ -2616,7 +2629,7 @@
         <w:rPr/>
         <w:t xml:space="preserve">[21] </w:t>
       </w:r>
-      <w:hyperlink r:id="rId33">
+      <w:hyperlink r:id="rId34">
         <w:r>
           <w:rPr>
             <w:color w:val="175C91"/>
@@ -2635,7 +2648,7 @@
         <w:rPr/>
         <w:t xml:space="preserve">[22] </w:t>
       </w:r>
-      <w:hyperlink r:id="rId34">
+      <w:hyperlink r:id="rId35">
         <w:r>
           <w:rPr>
             <w:color w:val="175C91"/>
@@ -2654,7 +2667,7 @@
         <w:rPr/>
         <w:t xml:space="preserve">[23] </w:t>
       </w:r>
-      <w:hyperlink r:id="rId35">
+      <w:hyperlink r:id="rId36">
         <w:r>
           <w:rPr>
             <w:color w:val="175C91"/>
@@ -2673,7 +2686,7 @@
         <w:rPr/>
         <w:t xml:space="preserve">[24] </w:t>
       </w:r>
-      <w:hyperlink r:id="rId36">
+      <w:hyperlink r:id="rId37">
         <w:r>
           <w:rPr>
             <w:color w:val="175C91"/>
@@ -2692,7 +2705,7 @@
         <w:rPr/>
         <w:t xml:space="preserve">[25] </w:t>
       </w:r>
-      <w:hyperlink r:id="rId37">
+      <w:hyperlink r:id="rId38">
         <w:r>
           <w:rPr>
             <w:color w:val="175C91"/>
@@ -2726,7 +2739,7 @@
         <w:rPr/>
         <w:t xml:space="preserve">[U1] </w:t>
       </w:r>
-      <w:hyperlink r:id="rId38">
+      <w:hyperlink r:id="rId39">
         <w:r>
           <w:rPr>
             <w:color w:val="175C91"/>
@@ -2745,7 +2758,7 @@
         <w:rPr/>
         <w:t xml:space="preserve">[U1a] </w:t>
       </w:r>
-      <w:hyperlink r:id="rId39">
+      <w:hyperlink r:id="rId40">
         <w:r>
           <w:rPr>
             <w:color w:val="175C91"/>
@@ -2764,7 +2777,7 @@
         <w:rPr/>
         <w:t xml:space="preserve">[P1] </w:t>
       </w:r>
-      <w:hyperlink r:id="rId40">
+      <w:hyperlink r:id="rId41">
         <w:r>
           <w:rPr>
             <w:color w:val="175C91"/>

</xml_diff>